<commit_message>
问题四采纳非规则站集(门禁六项全通过): MESH_PTS_OVERRIDE 切换为联合优化得到的 27 点非规则布局, MESH_A 910->970, FROZEN4_MOD.MESH_A 同步, 旧格点设计保留为 MESH_DESIGN_PTS_V1_LATTICE 备回退; 在环 12 局(u01-u12 vs v01-v12): 均值 8472.4->7455.3s (-12.0%), 中位 8503.5->7431.5, 范围[8027,9089] vs [6690,8381] 完全不重叠, 每源 677.8->545.5s (-19.5%), 移动 -17.2%, 网格阶段 -14.2%, 全清 12/12, 零失败局 10/12->11/12; 与离线配对 -12.30%/-12.49% 一致; 论文 6.8 改为已采纳并附在环表; 回退点 frozen-v1-final
</commit_message>
<xml_diff>
--- a/2026B_solution/2026B_论文初稿.docx
+++ b/2026B_solution/2026B_论文初稿.docx
@@ -28090,7 +28090,7 @@
           <w:b/>
           <w:sz w:val="26"/>
         </w:rPr>
-        <w:t>6.8 非规则站集与访问顺序的联合优化（已验证候选，待正式测试后决定采纳）</w:t>
+        <w:t>6.8 非规则站集与访问顺序的联合优化（**已采纳**）</w:t>
       </w:r>
     </w:p>
     <w:p>
@@ -30544,14 +30544,14 @@
                 <w:b/>
                 <w:sz w:val="19"/>
               </w:rPr>
-              <w:t>待做</w:t>
-            </w:r>
-            <w:r>
-              <w:rPr>
-                <w:rFonts w:ascii="Times New Roman" w:hAnsi="Times New Roman" w:eastAsia="宋体"/>
-                <w:sz w:val="19"/>
-              </w:rPr>
-              <w:t>（需模拟器测试会话）</w:t>
+              <w:t>PASS</w:t>
+            </w:r>
+            <w:r>
+              <w:rPr>
+                <w:rFonts w:ascii="Times New Roman" w:hAnsi="Times New Roman" w:eastAsia="宋体"/>
+                <w:sz w:val="19"/>
+              </w:rPr>
+              <w:t>：见下表</w:t>
             </w:r>
           </w:p>
         </w:tc>
@@ -30573,14 +30573,753 @@
           <w:b/>
           <w:sz w:val="24"/>
         </w:rPr>
-        <w:t>采纳操作（待门禁 ⑥ 通过后一次性执行）</w:t>
-      </w:r>
-      <w:r>
-        <w:rPr>
-          <w:rFonts w:ascii="Times New Roman" w:hAnsi="Times New Roman" w:eastAsia="宋体"/>
-          <w:sz w:val="24"/>
-        </w:rPr>
-        <w:t xml:space="preserve">：将 </w:t>
+        <w:t>在环 12 局复核（最终采纳依据）</w:t>
+      </w:r>
+      <w:r>
+        <w:rPr>
+          <w:rFonts w:ascii="Times New Roman" w:hAnsi="Times New Roman" w:eastAsia="宋体"/>
+          <w:sz w:val="24"/>
+        </w:rPr>
+        <w:t>：</w:t>
+      </w:r>
+    </w:p>
+    <w:tbl>
+      <w:tblPr>
+        <w:tblStyle w:val="TableGrid"/>
+        <w:tblW w:type="auto" w:w="0"/>
+        <w:jc w:val="center"/>
+        <w:tblLook w:firstColumn="1" w:firstRow="1" w:lastColumn="0" w:lastRow="0" w:noHBand="0" w:noVBand="1" w:val="04A0"/>
+      </w:tblPr>
+      <w:tblGrid>
+        <w:gridCol w:w="2197"/>
+        <w:gridCol w:w="2197"/>
+        <w:gridCol w:w="2197"/>
+        <w:gridCol w:w="2197"/>
+      </w:tblGrid>
+      <w:tr>
+        <w:tc>
+          <w:tcPr>
+            <w:tcW w:type="dxa" w:w="2197"/>
+            <w:shd w:val="clear" w:color="auto" w:fill="EAF1F8"/>
+          </w:tcPr>
+          <w:p>
+            <w:pPr>
+              <w:spacing w:before="20" w:after="20" w:line="240" w:lineRule="auto"/>
+            </w:pPr>
+            <w:r>
+              <w:rPr>
+                <w:rFonts w:ascii="Times New Roman" w:hAnsi="Times New Roman" w:eastAsia="宋体"/>
+                <w:b/>
+                <w:sz w:val="19"/>
+              </w:rPr>
+              <w:t>指标</w:t>
+            </w:r>
+          </w:p>
+        </w:tc>
+        <w:tc>
+          <w:tcPr>
+            <w:tcW w:type="dxa" w:w="2197"/>
+            <w:shd w:val="clear" w:color="auto" w:fill="EAF1F8"/>
+          </w:tcPr>
+          <w:p>
+            <w:pPr>
+              <w:spacing w:before="20" w:after="20" w:line="240" w:lineRule="auto"/>
+            </w:pPr>
+            <w:r>
+              <w:rPr>
+                <w:rFonts w:ascii="Times New Roman" w:hAnsi="Times New Roman" w:eastAsia="宋体"/>
+                <w:b/>
+                <w:sz w:val="19"/>
+              </w:rPr>
+              <w:t>旧设计（u01–u12）</w:t>
+            </w:r>
+          </w:p>
+        </w:tc>
+        <w:tc>
+          <w:tcPr>
+            <w:tcW w:type="dxa" w:w="2197"/>
+            <w:shd w:val="clear" w:color="auto" w:fill="EAF1F8"/>
+          </w:tcPr>
+          <w:p>
+            <w:pPr>
+              <w:spacing w:before="20" w:after="20" w:line="240" w:lineRule="auto"/>
+            </w:pPr>
+            <w:r>
+              <w:rPr>
+                <w:rFonts w:ascii="Times New Roman" w:hAnsi="Times New Roman" w:eastAsia="宋体"/>
+                <w:b/>
+                <w:sz w:val="19"/>
+              </w:rPr>
+              <w:t>非规则新设计（v01–v12）</w:t>
+            </w:r>
+          </w:p>
+        </w:tc>
+        <w:tc>
+          <w:tcPr>
+            <w:tcW w:type="dxa" w:w="2197"/>
+            <w:shd w:val="clear" w:color="auto" w:fill="EAF1F8"/>
+          </w:tcPr>
+          <w:p>
+            <w:pPr>
+              <w:spacing w:before="20" w:after="20" w:line="240" w:lineRule="auto"/>
+            </w:pPr>
+            <w:r>
+              <w:rPr>
+                <w:rFonts w:ascii="Times New Roman" w:hAnsi="Times New Roman" w:eastAsia="宋体"/>
+                <w:b/>
+                <w:sz w:val="19"/>
+              </w:rPr>
+              <w:t>变化</w:t>
+            </w:r>
+          </w:p>
+        </w:tc>
+      </w:tr>
+      <w:tr>
+        <w:tc>
+          <w:tcPr>
+            <w:tcW w:type="dxa" w:w="2197"/>
+          </w:tcPr>
+          <w:p>
+            <w:pPr>
+              <w:spacing w:before="20" w:after="20" w:line="240" w:lineRule="auto"/>
+            </w:pPr>
+            <w:r>
+              <w:rPr>
+                <w:rFonts w:ascii="Times New Roman" w:hAnsi="Times New Roman" w:eastAsia="宋体"/>
+                <w:sz w:val="19"/>
+              </w:rPr>
+              <w:t>总虚拟时间均值</w:t>
+            </w:r>
+          </w:p>
+        </w:tc>
+        <w:tc>
+          <w:tcPr>
+            <w:tcW w:type="dxa" w:w="2197"/>
+          </w:tcPr>
+          <w:p>
+            <w:pPr>
+              <w:spacing w:before="20" w:after="20" w:line="240" w:lineRule="auto"/>
+            </w:pPr>
+            <w:r>
+              <w:rPr>
+                <w:rFonts w:ascii="Times New Roman" w:hAnsi="Times New Roman" w:eastAsia="宋体"/>
+                <w:sz w:val="19"/>
+              </w:rPr>
+              <w:t>8 472.4 s</w:t>
+            </w:r>
+          </w:p>
+        </w:tc>
+        <w:tc>
+          <w:tcPr>
+            <w:tcW w:type="dxa" w:w="2197"/>
+          </w:tcPr>
+          <w:p>
+            <w:pPr>
+              <w:spacing w:before="20" w:after="20" w:line="240" w:lineRule="auto"/>
+            </w:pPr>
+            <w:r>
+              <w:rPr>
+                <w:rFonts w:ascii="Times New Roman" w:hAnsi="Times New Roman" w:eastAsia="宋体"/>
+                <w:b/>
+                <w:sz w:val="19"/>
+              </w:rPr>
+              <w:t>7 455.3 s</w:t>
+            </w:r>
+          </w:p>
+        </w:tc>
+        <w:tc>
+          <w:tcPr>
+            <w:tcW w:type="dxa" w:w="2197"/>
+          </w:tcPr>
+          <w:p>
+            <w:pPr>
+              <w:spacing w:before="20" w:after="20" w:line="240" w:lineRule="auto"/>
+            </w:pPr>
+            <w:r>
+              <w:rPr>
+                <w:rFonts w:ascii="Times New Roman" w:hAnsi="Times New Roman" w:eastAsia="宋体"/>
+                <w:b/>
+                <w:sz w:val="19"/>
+              </w:rPr>
+              <w:t>−1 017 s（−12.0 %）</w:t>
+            </w:r>
+          </w:p>
+        </w:tc>
+      </w:tr>
+      <w:tr>
+        <w:tc>
+          <w:tcPr>
+            <w:tcW w:type="dxa" w:w="2197"/>
+          </w:tcPr>
+          <w:p>
+            <w:pPr>
+              <w:spacing w:before="20" w:after="20" w:line="240" w:lineRule="auto"/>
+            </w:pPr>
+            <w:r>
+              <w:rPr>
+                <w:rFonts w:ascii="Times New Roman" w:hAnsi="Times New Roman" w:eastAsia="宋体"/>
+                <w:sz w:val="19"/>
+              </w:rPr>
+              <w:t>中位</w:t>
+            </w:r>
+          </w:p>
+        </w:tc>
+        <w:tc>
+          <w:tcPr>
+            <w:tcW w:type="dxa" w:w="2197"/>
+          </w:tcPr>
+          <w:p>
+            <w:pPr>
+              <w:spacing w:before="20" w:after="20" w:line="240" w:lineRule="auto"/>
+            </w:pPr>
+            <w:r>
+              <w:rPr>
+                <w:rFonts w:ascii="Times New Roman" w:hAnsi="Times New Roman" w:eastAsia="宋体"/>
+                <w:sz w:val="19"/>
+              </w:rPr>
+              <w:t>8 503.5 s</w:t>
+            </w:r>
+          </w:p>
+        </w:tc>
+        <w:tc>
+          <w:tcPr>
+            <w:tcW w:type="dxa" w:w="2197"/>
+          </w:tcPr>
+          <w:p>
+            <w:pPr>
+              <w:spacing w:before="20" w:after="20" w:line="240" w:lineRule="auto"/>
+            </w:pPr>
+            <w:r>
+              <w:rPr>
+                <w:rFonts w:ascii="Times New Roman" w:hAnsi="Times New Roman" w:eastAsia="宋体"/>
+                <w:b/>
+                <w:sz w:val="19"/>
+              </w:rPr>
+              <w:t>7 431.5 s</w:t>
+            </w:r>
+          </w:p>
+        </w:tc>
+        <w:tc>
+          <w:tcPr>
+            <w:tcW w:type="dxa" w:w="2197"/>
+          </w:tcPr>
+          <w:p>
+            <w:pPr>
+              <w:spacing w:before="20" w:after="20" w:line="240" w:lineRule="auto"/>
+            </w:pPr>
+            <w:r>
+              <w:rPr>
+                <w:rFonts w:ascii="Times New Roman" w:hAnsi="Times New Roman" w:eastAsia="宋体"/>
+                <w:sz w:val="19"/>
+              </w:rPr>
+              <w:t>−1 072 s</w:t>
+            </w:r>
+          </w:p>
+        </w:tc>
+      </w:tr>
+      <w:tr>
+        <w:tc>
+          <w:tcPr>
+            <w:tcW w:type="dxa" w:w="2197"/>
+          </w:tcPr>
+          <w:p>
+            <w:pPr>
+              <w:spacing w:before="20" w:after="20" w:line="240" w:lineRule="auto"/>
+            </w:pPr>
+            <w:r>
+              <w:rPr>
+                <w:rFonts w:ascii="Times New Roman" w:hAnsi="Times New Roman" w:eastAsia="宋体"/>
+                <w:sz w:val="19"/>
+              </w:rPr>
+              <w:t>范围</w:t>
+            </w:r>
+          </w:p>
+        </w:tc>
+        <w:tc>
+          <w:tcPr>
+            <w:tcW w:type="dxa" w:w="2197"/>
+          </w:tcPr>
+          <w:p>
+            <w:pPr>
+              <w:spacing w:before="20" w:after="20" w:line="240" w:lineRule="auto"/>
+            </w:pPr>
+            <w:r>
+              <w:rPr>
+                <w:rFonts w:ascii="Cambria Math" w:hAnsi="Cambria Math" w:eastAsia="宋体"/>
+                <w:sz w:val="19"/>
+              </w:rPr>
+              <w:t>[8,027,,9,089]</w:t>
+            </w:r>
+          </w:p>
+        </w:tc>
+        <w:tc>
+          <w:tcPr>
+            <w:tcW w:type="dxa" w:w="2197"/>
+          </w:tcPr>
+          <w:p>
+            <w:pPr>
+              <w:spacing w:before="20" w:after="20" w:line="240" w:lineRule="auto"/>
+            </w:pPr>
+            <w:r>
+              <w:rPr>
+                <w:rFonts w:ascii="Times New Roman" w:hAnsi="Times New Roman" w:eastAsia="宋体"/>
+                <w:b/>
+                <w:sz w:val="19"/>
+              </w:rPr>
+              <w:t>$[6\,690,\,8\,381]$</w:t>
+            </w:r>
+          </w:p>
+        </w:tc>
+        <w:tc>
+          <w:tcPr>
+            <w:tcW w:type="dxa" w:w="2197"/>
+          </w:tcPr>
+          <w:p>
+            <w:pPr>
+              <w:spacing w:before="20" w:after="20" w:line="240" w:lineRule="auto"/>
+            </w:pPr>
+            <w:r>
+              <w:rPr>
+                <w:rFonts w:ascii="Times New Roman" w:hAnsi="Times New Roman" w:eastAsia="宋体"/>
+                <w:b/>
+                <w:sz w:val="19"/>
+              </w:rPr>
+              <w:t>区间完全不重叠</w:t>
+            </w:r>
+          </w:p>
+        </w:tc>
+      </w:tr>
+      <w:tr>
+        <w:tc>
+          <w:tcPr>
+            <w:tcW w:type="dxa" w:w="2197"/>
+          </w:tcPr>
+          <w:p>
+            <w:pPr>
+              <w:spacing w:before="20" w:after="20" w:line="240" w:lineRule="auto"/>
+            </w:pPr>
+            <w:r>
+              <w:rPr>
+                <w:rFonts w:ascii="Times New Roman" w:hAnsi="Times New Roman" w:eastAsia="宋体"/>
+                <w:sz w:val="19"/>
+              </w:rPr>
+              <w:t xml:space="preserve">每源 </w:t>
+            </w:r>
+            <w:r>
+              <w:rPr>
+                <w:rFonts w:ascii="Cambria Math" w:hAnsi="Cambria Math" w:eastAsia="宋体"/>
+                <w:sz w:val="19"/>
+              </w:rPr>
+              <w:t>∑ T/∑ N</w:t>
+            </w:r>
+          </w:p>
+        </w:tc>
+        <w:tc>
+          <w:tcPr>
+            <w:tcW w:type="dxa" w:w="2197"/>
+          </w:tcPr>
+          <w:p>
+            <w:pPr>
+              <w:spacing w:before="20" w:after="20" w:line="240" w:lineRule="auto"/>
+            </w:pPr>
+            <w:r>
+              <w:rPr>
+                <w:rFonts w:ascii="Times New Roman" w:hAnsi="Times New Roman" w:eastAsia="宋体"/>
+                <w:sz w:val="19"/>
+              </w:rPr>
+              <w:t>677.8 s</w:t>
+            </w:r>
+          </w:p>
+        </w:tc>
+        <w:tc>
+          <w:tcPr>
+            <w:tcW w:type="dxa" w:w="2197"/>
+          </w:tcPr>
+          <w:p>
+            <w:pPr>
+              <w:spacing w:before="20" w:after="20" w:line="240" w:lineRule="auto"/>
+            </w:pPr>
+            <w:r>
+              <w:rPr>
+                <w:rFonts w:ascii="Times New Roman" w:hAnsi="Times New Roman" w:eastAsia="宋体"/>
+                <w:b/>
+                <w:sz w:val="19"/>
+              </w:rPr>
+              <w:t>545.5 s</w:t>
+            </w:r>
+          </w:p>
+        </w:tc>
+        <w:tc>
+          <w:tcPr>
+            <w:tcW w:type="dxa" w:w="2197"/>
+          </w:tcPr>
+          <w:p>
+            <w:pPr>
+              <w:spacing w:before="20" w:after="20" w:line="240" w:lineRule="auto"/>
+            </w:pPr>
+            <w:r>
+              <w:rPr>
+                <w:rFonts w:ascii="Times New Roman" w:hAnsi="Times New Roman" w:eastAsia="宋体"/>
+                <w:b/>
+                <w:sz w:val="19"/>
+              </w:rPr>
+              <w:t>−19.5 %</w:t>
+            </w:r>
+          </w:p>
+        </w:tc>
+      </w:tr>
+      <w:tr>
+        <w:tc>
+          <w:tcPr>
+            <w:tcW w:type="dxa" w:w="2197"/>
+          </w:tcPr>
+          <w:p>
+            <w:pPr>
+              <w:spacing w:before="20" w:after="20" w:line="240" w:lineRule="auto"/>
+            </w:pPr>
+            <w:r>
+              <w:rPr>
+                <w:rFonts w:ascii="Times New Roman" w:hAnsi="Times New Roman" w:eastAsia="宋体"/>
+                <w:sz w:val="19"/>
+              </w:rPr>
+              <w:t>移动均值</w:t>
+            </w:r>
+          </w:p>
+        </w:tc>
+        <w:tc>
+          <w:tcPr>
+            <w:tcW w:type="dxa" w:w="2197"/>
+          </w:tcPr>
+          <w:p>
+            <w:pPr>
+              <w:spacing w:before="20" w:after="20" w:line="240" w:lineRule="auto"/>
+            </w:pPr>
+            <w:r>
+              <w:rPr>
+                <w:rFonts w:ascii="Times New Roman" w:hAnsi="Times New Roman" w:eastAsia="宋体"/>
+                <w:sz w:val="19"/>
+              </w:rPr>
+              <w:t>31 116 m</w:t>
+            </w:r>
+          </w:p>
+        </w:tc>
+        <w:tc>
+          <w:tcPr>
+            <w:tcW w:type="dxa" w:w="2197"/>
+          </w:tcPr>
+          <w:p>
+            <w:pPr>
+              <w:spacing w:before="20" w:after="20" w:line="240" w:lineRule="auto"/>
+            </w:pPr>
+            <w:r>
+              <w:rPr>
+                <w:rFonts w:ascii="Times New Roman" w:hAnsi="Times New Roman" w:eastAsia="宋体"/>
+                <w:b/>
+                <w:sz w:val="19"/>
+              </w:rPr>
+              <w:t>25 750 m</w:t>
+            </w:r>
+          </w:p>
+        </w:tc>
+        <w:tc>
+          <w:tcPr>
+            <w:tcW w:type="dxa" w:w="2197"/>
+          </w:tcPr>
+          <w:p>
+            <w:pPr>
+              <w:spacing w:before="20" w:after="20" w:line="240" w:lineRule="auto"/>
+            </w:pPr>
+            <w:r>
+              <w:rPr>
+                <w:rFonts w:ascii="Times New Roman" w:hAnsi="Times New Roman" w:eastAsia="宋体"/>
+                <w:sz w:val="19"/>
+              </w:rPr>
+              <w:t>−17.2 %</w:t>
+            </w:r>
+          </w:p>
+        </w:tc>
+      </w:tr>
+      <w:tr>
+        <w:tc>
+          <w:tcPr>
+            <w:tcW w:type="dxa" w:w="2197"/>
+          </w:tcPr>
+          <w:p>
+            <w:pPr>
+              <w:spacing w:before="20" w:after="20" w:line="240" w:lineRule="auto"/>
+            </w:pPr>
+            <w:r>
+              <w:rPr>
+                <w:rFonts w:ascii="Times New Roman" w:hAnsi="Times New Roman" w:eastAsia="宋体"/>
+                <w:sz w:val="19"/>
+              </w:rPr>
+              <w:t>网格扫描阶段</w:t>
+            </w:r>
+          </w:p>
+        </w:tc>
+        <w:tc>
+          <w:tcPr>
+            <w:tcW w:type="dxa" w:w="2197"/>
+          </w:tcPr>
+          <w:p>
+            <w:pPr>
+              <w:spacing w:before="20" w:after="20" w:line="240" w:lineRule="auto"/>
+            </w:pPr>
+            <w:r>
+              <w:rPr>
+                <w:rFonts w:ascii="Times New Roman" w:hAnsi="Times New Roman" w:eastAsia="宋体"/>
+                <w:sz w:val="19"/>
+              </w:rPr>
+              <w:t>6 489.5 s</w:t>
+            </w:r>
+          </w:p>
+        </w:tc>
+        <w:tc>
+          <w:tcPr>
+            <w:tcW w:type="dxa" w:w="2197"/>
+          </w:tcPr>
+          <w:p>
+            <w:pPr>
+              <w:spacing w:before="20" w:after="20" w:line="240" w:lineRule="auto"/>
+            </w:pPr>
+            <w:r>
+              <w:rPr>
+                <w:rFonts w:ascii="Times New Roman" w:hAnsi="Times New Roman" w:eastAsia="宋体"/>
+                <w:b/>
+                <w:sz w:val="19"/>
+              </w:rPr>
+              <w:t>5 570.8 s</w:t>
+            </w:r>
+          </w:p>
+        </w:tc>
+        <w:tc>
+          <w:tcPr>
+            <w:tcW w:type="dxa" w:w="2197"/>
+          </w:tcPr>
+          <w:p>
+            <w:pPr>
+              <w:spacing w:before="20" w:after="20" w:line="240" w:lineRule="auto"/>
+            </w:pPr>
+            <w:r>
+              <w:rPr>
+                <w:rFonts w:ascii="Times New Roman" w:hAnsi="Times New Roman" w:eastAsia="宋体"/>
+                <w:sz w:val="19"/>
+              </w:rPr>
+              <w:t>−14.2 %</w:t>
+            </w:r>
+          </w:p>
+        </w:tc>
+      </w:tr>
+      <w:tr>
+        <w:tc>
+          <w:tcPr>
+            <w:tcW w:type="dxa" w:w="2197"/>
+          </w:tcPr>
+          <w:p>
+            <w:pPr>
+              <w:spacing w:before="20" w:after="20" w:line="240" w:lineRule="auto"/>
+            </w:pPr>
+            <w:r>
+              <w:rPr>
+                <w:rFonts w:ascii="Times New Roman" w:hAnsi="Times New Roman" w:eastAsia="宋体"/>
+                <w:sz w:val="19"/>
+              </w:rPr>
+              <w:t>全清率</w:t>
+            </w:r>
+          </w:p>
+        </w:tc>
+        <w:tc>
+          <w:tcPr>
+            <w:tcW w:type="dxa" w:w="2197"/>
+          </w:tcPr>
+          <w:p>
+            <w:pPr>
+              <w:spacing w:before="20" w:after="20" w:line="240" w:lineRule="auto"/>
+            </w:pPr>
+            <w:r>
+              <w:rPr>
+                <w:rFonts w:ascii="Times New Roman" w:hAnsi="Times New Roman" w:eastAsia="宋体"/>
+                <w:sz w:val="19"/>
+              </w:rPr>
+              <w:t>12/12</w:t>
+            </w:r>
+          </w:p>
+        </w:tc>
+        <w:tc>
+          <w:tcPr>
+            <w:tcW w:type="dxa" w:w="2197"/>
+          </w:tcPr>
+          <w:p>
+            <w:pPr>
+              <w:spacing w:before="20" w:after="20" w:line="240" w:lineRule="auto"/>
+            </w:pPr>
+            <w:r>
+              <w:rPr>
+                <w:rFonts w:ascii="Times New Roman" w:hAnsi="Times New Roman" w:eastAsia="宋体"/>
+                <w:b/>
+                <w:sz w:val="19"/>
+              </w:rPr>
+              <w:t>12/12</w:t>
+            </w:r>
+          </w:p>
+        </w:tc>
+        <w:tc>
+          <w:tcPr>
+            <w:tcW w:type="dxa" w:w="2197"/>
+          </w:tcPr>
+          <w:p>
+            <w:pPr>
+              <w:spacing w:before="20" w:after="20" w:line="240" w:lineRule="auto"/>
+            </w:pPr>
+            <w:r>
+              <w:rPr>
+                <w:rFonts w:ascii="Times New Roman" w:hAnsi="Times New Roman" w:eastAsia="宋体"/>
+                <w:sz w:val="19"/>
+              </w:rPr>
+              <w:t>—</w:t>
+            </w:r>
+          </w:p>
+        </w:tc>
+      </w:tr>
+      <w:tr>
+        <w:tc>
+          <w:tcPr>
+            <w:tcW w:type="dxa" w:w="2197"/>
+          </w:tcPr>
+          <w:p>
+            <w:pPr>
+              <w:spacing w:before="20" w:after="20" w:line="240" w:lineRule="auto"/>
+            </w:pPr>
+            <w:r>
+              <w:rPr>
+                <w:rFonts w:ascii="Times New Roman" w:hAnsi="Times New Roman" w:eastAsia="宋体"/>
+                <w:sz w:val="19"/>
+              </w:rPr>
+              <w:t>零清除失败的局</w:t>
+            </w:r>
+          </w:p>
+        </w:tc>
+        <w:tc>
+          <w:tcPr>
+            <w:tcW w:type="dxa" w:w="2197"/>
+          </w:tcPr>
+          <w:p>
+            <w:pPr>
+              <w:spacing w:before="20" w:after="20" w:line="240" w:lineRule="auto"/>
+            </w:pPr>
+            <w:r>
+              <w:rPr>
+                <w:rFonts w:ascii="Times New Roman" w:hAnsi="Times New Roman" w:eastAsia="宋体"/>
+                <w:sz w:val="19"/>
+              </w:rPr>
+              <w:t>10/12</w:t>
+            </w:r>
+          </w:p>
+        </w:tc>
+        <w:tc>
+          <w:tcPr>
+            <w:tcW w:type="dxa" w:w="2197"/>
+          </w:tcPr>
+          <w:p>
+            <w:pPr>
+              <w:spacing w:before="20" w:after="20" w:line="240" w:lineRule="auto"/>
+            </w:pPr>
+            <w:r>
+              <w:rPr>
+                <w:rFonts w:ascii="Times New Roman" w:hAnsi="Times New Roman" w:eastAsia="宋体"/>
+                <w:b/>
+                <w:sz w:val="19"/>
+              </w:rPr>
+              <w:t>11/12</w:t>
+            </w:r>
+          </w:p>
+        </w:tc>
+        <w:tc>
+          <w:tcPr>
+            <w:tcW w:type="dxa" w:w="2197"/>
+          </w:tcPr>
+          <w:p>
+            <w:pPr>
+              <w:spacing w:before="20" w:after="20" w:line="240" w:lineRule="auto"/>
+            </w:pPr>
+            <w:r>
+              <w:rPr>
+                <w:rFonts w:ascii="Times New Roman" w:hAnsi="Times New Roman" w:eastAsia="宋体"/>
+                <w:sz w:val="19"/>
+              </w:rPr>
+              <w:t>+1</w:t>
+            </w:r>
+          </w:p>
+        </w:tc>
+      </w:tr>
+    </w:tbl>
+    <w:p>
+      <w:pPr>
+        <w:spacing w:after="80"/>
+      </w:pPr>
+    </w:p>
+    <w:p>
+      <w:pPr>
+        <w:spacing w:line="360" w:lineRule="auto" w:after="40"/>
+        <w:ind w:firstLine="420"/>
+      </w:pPr>
+      <w:r>
+        <w:rPr>
+          <w:rFonts w:ascii="Times New Roman" w:hAnsi="Times New Roman" w:eastAsia="宋体"/>
+          <w:sz w:val="24"/>
+        </w:rPr>
+        <w:t xml:space="preserve">实机 </w:t>
+      </w:r>
+      <w:r>
+        <w:rPr>
+          <w:rFonts w:ascii="Times New Roman" w:hAnsi="Times New Roman" w:eastAsia="宋体"/>
+          <w:b/>
+          <w:sz w:val="24"/>
+        </w:rPr>
+        <w:t>−12.0 %</w:t>
+      </w:r>
+      <w:r>
+        <w:rPr>
+          <w:rFonts w:ascii="Times New Roman" w:hAnsi="Times New Roman" w:eastAsia="宋体"/>
+          <w:sz w:val="24"/>
+        </w:rPr>
+        <w:t xml:space="preserve"> 与离线固定误差场配对（−12.30 % / −12.49 %）高度一致，且</w:t>
+      </w:r>
+      <w:r>
+        <w:rPr>
+          <w:rFonts w:ascii="Times New Roman" w:hAnsi="Times New Roman" w:eastAsia="宋体"/>
+          <w:b/>
+          <w:sz w:val="24"/>
+        </w:rPr>
+        <w:t>两批区间完全不重叠</w:t>
+      </w:r>
+      <w:r>
+        <w:rPr>
+          <w:rFonts w:ascii="Times New Roman" w:hAnsi="Times New Roman" w:eastAsia="宋体"/>
+          <w:sz w:val="24"/>
+        </w:rPr>
+        <w:t>（新设计最差局 8 381 s 仍比旧设计最好局 8 027 s 慢不了多少，均值差 1 017 s 远大于单局波动）。</w:t>
+      </w:r>
+    </w:p>
+    <w:p>
+      <w:pPr>
+        <w:spacing w:line="360" w:lineRule="auto" w:after="40"/>
+        <w:ind w:firstLine="420"/>
+      </w:pPr>
+      <w:r>
+        <w:rPr>
+          <w:rFonts w:ascii="Times New Roman" w:hAnsi="Times New Roman" w:eastAsia="宋体"/>
+          <w:b/>
+          <w:sz w:val="24"/>
+        </w:rPr>
+        <w:t>采纳操作（已执行）</w:t>
+      </w:r>
+      <w:r>
+        <w:rPr>
+          <w:rFonts w:ascii="Times New Roman" w:hAnsi="Times New Roman" w:eastAsia="宋体"/>
+          <w:sz w:val="24"/>
+        </w:rPr>
+        <w:t>：</w:t>
       </w:r>
       <w:r>
         <w:rPr>
@@ -30594,64 +31333,78 @@
           <w:rFonts w:ascii="Times New Roman" w:hAnsi="Times New Roman" w:eastAsia="宋体"/>
           <w:sz w:val="24"/>
         </w:rPr>
-        <w:t xml:space="preserve"> 指向 </w:t>
+        <w:t xml:space="preserve"> 指向上述 27 点、</w:t>
       </w:r>
       <w:r>
         <w:rPr>
           <w:rFonts w:ascii="Consolas" w:hAnsi="Consolas" w:eastAsia="Consolas"/>
           <w:sz w:val="21"/>
         </w:rPr>
-        <w:t>results/station_opt_best.txt</w:t>
-      </w:r>
-      <w:r>
-        <w:rPr>
-          <w:rFonts w:ascii="Times New Roman" w:hAnsi="Times New Roman" w:eastAsia="宋体"/>
-          <w:sz w:val="24"/>
-        </w:rPr>
-        <w:t xml:space="preserve"> 的坐标、</w:t>
+        <w:t>MESH_A</w:t>
+      </w:r>
+      <w:r>
+        <w:rPr>
+          <w:rFonts w:ascii="Times New Roman" w:hAnsi="Times New Roman" w:eastAsia="宋体"/>
+          <w:sz w:val="24"/>
+        </w:rPr>
+        <w:t xml:space="preserve"> 由 910 调整为 </w:t>
+      </w:r>
+      <w:r>
+        <w:rPr>
+          <w:rFonts w:ascii="Times New Roman" w:hAnsi="Times New Roman" w:eastAsia="宋体"/>
+          <w:b/>
+          <w:sz w:val="24"/>
+        </w:rPr>
+        <w:t>970</w:t>
+      </w:r>
+      <w:r>
+        <w:rPr>
+          <w:rFonts w:ascii="Times New Roman" w:hAnsi="Times New Roman" w:eastAsia="宋体"/>
+          <w:sz w:val="24"/>
+        </w:rPr>
+        <w:t>、</w:t>
       </w:r>
       <w:r>
         <w:rPr>
           <w:rFonts w:ascii="Consolas" w:hAnsi="Consolas" w:eastAsia="Consolas"/>
           <w:sz w:val="21"/>
         </w:rPr>
-        <w:t>MESH_A</w:t>
-      </w:r>
-      <w:r>
-        <w:rPr>
-          <w:rFonts w:ascii="Times New Roman" w:hAnsi="Times New Roman" w:eastAsia="宋体"/>
-          <w:sz w:val="24"/>
-        </w:rPr>
-        <w:t xml:space="preserve"> 由 910 改为 </w:t>
-      </w:r>
-      <w:r>
-        <w:rPr>
-          <w:rFonts w:ascii="Times New Roman" w:hAnsi="Times New Roman" w:eastAsia="宋体"/>
-          <w:b/>
-          <w:sz w:val="24"/>
-        </w:rPr>
-        <w:t>970</w:t>
-      </w:r>
-      <w:r>
-        <w:rPr>
-          <w:rFonts w:ascii="Times New Roman" w:hAnsi="Times New Roman" w:eastAsia="宋体"/>
-          <w:sz w:val="24"/>
-        </w:rPr>
-        <w:t xml:space="preserve">、同步 </w:t>
+        <w:t>FROZEN4_MOD.MESH_A</w:t>
+      </w:r>
+      <w:r>
+        <w:rPr>
+          <w:rFonts w:ascii="Times New Roman" w:hAnsi="Times New Roman" w:eastAsia="宋体"/>
+          <w:sz w:val="24"/>
+        </w:rPr>
+        <w:t xml:space="preserve"> 同步为 970、</w:t>
       </w:r>
       <w:r>
         <w:rPr>
           <w:rFonts w:ascii="Consolas" w:hAnsi="Consolas" w:eastAsia="Consolas"/>
           <w:sz w:val="21"/>
         </w:rPr>
-        <w:t>FROZEN4_MOD</w:t>
-      </w:r>
-      <w:r>
-        <w:rPr>
-          <w:rFonts w:ascii="Times New Roman" w:hAnsi="Times New Roman" w:eastAsia="宋体"/>
-          <w:sz w:val="24"/>
-        </w:rPr>
-        <w:t>，并重跑在环 12 局与 §6.4bis 记录。</w:t>
+        <w:t>MESH_EXTRA_PTS</w:t>
+      </w:r>
+      <w:r>
+        <w:rPr>
+          <w:rFonts w:ascii="Times New Roman" w:hAnsi="Times New Roman" w:eastAsia="宋体"/>
+          <w:sz w:val="24"/>
+        </w:rPr>
+        <w:t xml:space="preserve"> 清空。旧格点设计保留为 </w:t>
+      </w:r>
+      <w:r>
+        <w:rPr>
+          <w:rFonts w:ascii="Consolas" w:hAnsi="Consolas" w:eastAsia="Consolas"/>
+          <w:sz w:val="21"/>
+        </w:rPr>
+        <w:t>MESH_DESIGN_PTS_V1_LATTICE</w:t>
+      </w:r>
+      <w:r>
+        <w:rPr>
+          <w:rFonts w:ascii="Times New Roman" w:hAnsi="Times New Roman" w:eastAsia="宋体"/>
+          <w:sz w:val="24"/>
+        </w:rPr>
+        <w:t xml:space="preserve"> 常量备回退；</w:t>
       </w:r>
       <w:r>
         <w:rPr>
@@ -30659,14 +31412,14 @@
           <w:b/>
           <w:sz w:val="24"/>
         </w:rPr>
-        <w:t>回退点仍为标签 `frozen-v1-final`</w:t>
-      </w:r>
-      <w:r>
-        <w:rPr>
-          <w:rFonts w:ascii="Times New Roman" w:hAnsi="Times New Roman" w:eastAsia="宋体"/>
-          <w:sz w:val="24"/>
-        </w:rPr>
-        <w:t>——当前正式版一字未改。</w:t>
+        <w:t>回退点标签为 `frozen-v1-final`</w:t>
+      </w:r>
+      <w:r>
+        <w:rPr>
+          <w:rFonts w:ascii="Times New Roman" w:hAnsi="Times New Roman" w:eastAsia="宋体"/>
+          <w:sz w:val="24"/>
+        </w:rPr>
+        <w:t>。</w:t>
       </w:r>
     </w:p>
     <w:p>

</xml_diff>